<commit_message>
Save recovered test document and images
</commit_message>
<xml_diff>
--- a/tests/tests.docx
+++ b/tests/tests.docx
@@ -1,6 +1,6 @@
 
 <file path=word/document.xml><?xml version="1.0" encoding="utf-8"?>
-<w:document xmlns:wpc="http://schemas.microsoft.com/office/word/2010/wordprocessingCanvas" xmlns:cx="http://schemas.microsoft.com/office/drawing/2014/chartex" xmlns:cx1="http://schemas.microsoft.com/office/drawing/2015/9/8/chartex" xmlns:cx2="http://schemas.microsoft.com/office/drawing/2015/10/21/chartex" xmlns:cx3="http://schemas.microsoft.com/office/drawing/2016/5/9/chartex" xmlns:cx4="http://schemas.microsoft.com/office/drawing/2016/5/10/chartex" xmlns:cx5="http://schemas.microsoft.com/office/drawing/2016/5/11/chartex" xmlns:cx6="http://schemas.microsoft.com/office/drawing/2016/5/12/chartex" xmlns:cx7="http://schemas.microsoft.com/office/drawing/2016/5/13/chartex" xmlns:cx8="http://schemas.microsoft.com/office/drawing/2016/5/14/chartex" xmlns:mc="http://schemas.openxmlformats.org/markup-compatibility/2006" xmlns:aink="http://schemas.microsoft.com/office/drawing/2016/ink" xmlns:am3d="http://schemas.microsoft.com/office/drawing/2017/model3d" xmlns:o="urn:schemas-microsoft-com:office:office" xmlns:oel="http://schemas.microsoft.com/office/2019/extlst" xmlns:r="http://schemas.openxmlformats.org/officeDocument/2006/relationships" xmlns:m="http://schemas.openxmlformats.org/officeDocument/2006/math" xmlns:v="urn:schemas-microsoft-com:vml" xmlns:wp14="http://schemas.microsoft.com/office/word/2010/wordprocessingDrawing" xmlns:wp="http://schemas.openxmlformats.org/drawingml/2006/wordprocessingDrawing" xmlns:w10="urn:schemas-microsoft-com:office:word" xmlns:w="http://schemas.openxmlformats.org/wordprocessingml/2006/main" xmlns:w14="http://schemas.microsoft.com/office/word/2010/wordml" xmlns:w15="http://schemas.microsoft.com/office/word/2012/wordml" xmlns:w16cei="http://schemas.microsoft.com/office/word/2026/wordml/cei" xmlns:w16cex="http://schemas.microsoft.com/office/word/2018/wordml/cex" xmlns:w16cid="http://schemas.microsoft.com/office/word/2016/wordml/cid" xmlns:w16="http://schemas.microsoft.com/office/word/2018/wordml" xmlns:w16du="http://schemas.microsoft.com/office/word/2023/wordml/word16du" xmlns:w16sdtdh="http://schemas.microsoft.com/office/word/2020/wordml/sdtdatahash" xmlns:w16sdtfl="http://schemas.microsoft.com/office/word/2024/wordml/sdtformatlock" xmlns:w16se="http://schemas.microsoft.com/office/word/2015/wordml/symex" xmlns:wpg="http://schemas.microsoft.com/office/word/2010/wordprocessingGroup" xmlns:wpi="http://schemas.microsoft.com/office/word/2010/wordprocessingInk" xmlns:wne="http://schemas.microsoft.com/office/word/2006/wordml" xmlns:wps="http://schemas.microsoft.com/office/word/2010/wordprocessingShape" mc:Ignorable="w14 w15 w16se w16cid w16 w16cex w16sdtdh w16sdtfl w16du wp14">
+<w:document xmlns:wpc="http://schemas.microsoft.com/office/word/2010/wordprocessingCanvas" xmlns:cx="http://schemas.microsoft.com/office/drawing/2014/chartex" xmlns:cx1="http://schemas.microsoft.com/office/drawing/2015/9/8/chartex" xmlns:cx2="http://schemas.microsoft.com/office/drawing/2015/10/21/chartex" xmlns:cx3="http://schemas.microsoft.com/office/drawing/2016/5/9/chartex" xmlns:cx4="http://schemas.microsoft.com/office/drawing/2016/5/10/chartex" xmlns:cx5="http://schemas.microsoft.com/office/drawing/2016/5/11/chartex" xmlns:cx6="http://schemas.microsoft.com/office/drawing/2016/5/12/chartex" xmlns:cx7="http://schemas.microsoft.com/office/drawing/2016/5/13/chartex" xmlns:cx8="http://schemas.microsoft.com/office/drawing/2016/5/14/chartex" xmlns:mc="http://schemas.openxmlformats.org/markup-compatibility/2006" xmlns:aink="http://schemas.microsoft.com/office/drawing/2016/ink" xmlns:am3d="http://schemas.microsoft.com/office/drawing/2017/model3d" xmlns:o="urn:schemas-microsoft-com:office:office" xmlns:oel="http://schemas.microsoft.com/office/2019/extlst" xmlns:r="http://schemas.openxmlformats.org/officeDocument/2006/relationships" xmlns:m="http://schemas.openxmlformats.org/officeDocument/2006/math" xmlns:v="urn:schemas-microsoft-com:vml" xmlns:wp14="http://schemas.microsoft.com/office/word/2010/wordprocessingDrawing" xmlns:wp="http://schemas.openxmlformats.org/drawingml/2006/wordprocessingDrawing" xmlns:w10="urn:schemas-microsoft-com:office:word" xmlns:w="http://schemas.openxmlformats.org/wordprocessingml/2006/main" xmlns:w14="http://schemas.microsoft.com/office/word/2010/wordml" xmlns:w15="http://schemas.microsoft.com/office/word/2012/wordml" xmlns:w16cex="http://schemas.microsoft.com/office/word/2018/wordml/cex" xmlns:w16cid="http://schemas.microsoft.com/office/word/2016/wordml/cid" xmlns:w16="http://schemas.microsoft.com/office/word/2018/wordml" xmlns:w16du="http://schemas.microsoft.com/office/word/2023/wordml/word16du" xmlns:w16sdtdh="http://schemas.microsoft.com/office/word/2020/wordml/sdtdatahash" xmlns:w16sdtfl="http://schemas.microsoft.com/office/word/2024/wordml/sdtformatlock" xmlns:w16se="http://schemas.microsoft.com/office/word/2015/wordml/symex" xmlns:wpg="http://schemas.microsoft.com/office/word/2010/wordprocessingGroup" xmlns:wpi="http://schemas.microsoft.com/office/word/2010/wordprocessingInk" xmlns:wne="http://schemas.microsoft.com/office/word/2006/wordml" xmlns:wps="http://schemas.microsoft.com/office/word/2010/wordprocessingShape" mc:Ignorable="w14 w15 w16se w16cid w16 w16cex w16sdtdh w16sdtfl w16du wp14">
   <w:body>
     <w:p>
       <w:pPr>
@@ -69,6 +69,9 @@
         </w:rPr>
       </w:pPr>
       <w:r>
+        <w:rPr>
+          <w:noProof/>
+        </w:rPr>
         <w:drawing>
           <wp:anchor distT="0" distB="0" distL="114300" distR="114300" simplePos="0" relativeHeight="251658240" behindDoc="0" locked="0" layoutInCell="1" allowOverlap="1" wp14:anchorId="706E8863" wp14:editId="6C920E76">
             <wp:simplePos x="0" y="0"/>
@@ -1511,6 +1514,9 @@
               <w:cnfStyle w:val="000000000000" w:firstRow="0" w:lastRow="0" w:firstColumn="0" w:lastColumn="0" w:oddVBand="0" w:evenVBand="0" w:oddHBand="0" w:evenHBand="0" w:firstRowFirstColumn="0" w:firstRowLastColumn="0" w:lastRowFirstColumn="0" w:lastRowLastColumn="0"/>
             </w:pPr>
             <w:r>
+              <w:rPr>
+                <w:noProof/>
+              </w:rPr>
               <w:lastRenderedPageBreak/>
               <w:drawing>
                 <wp:anchor distT="0" distB="0" distL="114300" distR="114300" simplePos="0" relativeHeight="251664384" behindDoc="0" locked="0" layoutInCell="1" allowOverlap="1" wp14:anchorId="127ADE06" wp14:editId="28EEBEE2">
@@ -1574,6 +1580,9 @@
               <w:cnfStyle w:val="000000000000" w:firstRow="0" w:lastRow="0" w:firstColumn="0" w:lastColumn="0" w:oddVBand="0" w:evenVBand="0" w:oddHBand="0" w:evenHBand="0" w:firstRowFirstColumn="0" w:firstRowLastColumn="0" w:lastRowFirstColumn="0" w:lastRowLastColumn="0"/>
             </w:pPr>
             <w:r>
+              <w:rPr>
+                <w:noProof/>
+              </w:rPr>
               <w:drawing>
                 <wp:anchor distT="0" distB="0" distL="114300" distR="114300" simplePos="0" relativeHeight="251666432" behindDoc="0" locked="0" layoutInCell="1" allowOverlap="1" wp14:anchorId="71B17681" wp14:editId="2F88DB7F">
                   <wp:simplePos x="0" y="0"/>
@@ -1631,6 +1640,9 @@
               </w:drawing>
             </w:r>
             <w:r>
+              <w:rPr>
+                <w:noProof/>
+              </w:rPr>
               <w:drawing>
                 <wp:anchor distT="0" distB="0" distL="114300" distR="114300" simplePos="0" relativeHeight="251665408" behindDoc="0" locked="0" layoutInCell="1" allowOverlap="1" wp14:anchorId="0CEDD055" wp14:editId="1C34644D">
                   <wp:simplePos x="0" y="0"/>
@@ -1841,6 +1853,9 @@
               <w:cnfStyle w:val="000000000000" w:firstRow="0" w:lastRow="0" w:firstColumn="0" w:lastColumn="0" w:oddVBand="0" w:evenVBand="0" w:oddHBand="0" w:evenHBand="0" w:firstRowFirstColumn="0" w:firstRowLastColumn="0" w:lastRowFirstColumn="0" w:lastRowLastColumn="0"/>
             </w:pPr>
             <w:r>
+              <w:rPr>
+                <w:noProof/>
+              </w:rPr>
               <w:lastRenderedPageBreak/>
               <w:drawing>
                 <wp:anchor distT="0" distB="0" distL="114300" distR="114300" simplePos="0" relativeHeight="251668480" behindDoc="0" locked="0" layoutInCell="1" allowOverlap="1" wp14:anchorId="6D1AF351" wp14:editId="68625E1B">
@@ -1958,6 +1973,9 @@
               <w:cnfStyle w:val="000000000000" w:firstRow="0" w:lastRow="0" w:firstColumn="0" w:lastColumn="0" w:oddVBand="0" w:evenVBand="0" w:oddHBand="0" w:evenHBand="0" w:firstRowFirstColumn="0" w:firstRowLastColumn="0" w:lastRowFirstColumn="0" w:lastRowLastColumn="0"/>
             </w:pPr>
             <w:r>
+              <w:rPr>
+                <w:noProof/>
+              </w:rPr>
               <w:drawing>
                 <wp:anchor distT="0" distB="0" distL="114300" distR="114300" simplePos="0" relativeHeight="251670528" behindDoc="0" locked="0" layoutInCell="1" allowOverlap="1" wp14:anchorId="7007539B" wp14:editId="3E12F536">
                   <wp:simplePos x="0" y="0"/>
@@ -2020,6 +2038,9 @@
               <w:cnfStyle w:val="000000000000" w:firstRow="0" w:lastRow="0" w:firstColumn="0" w:lastColumn="0" w:oddVBand="0" w:evenVBand="0" w:oddHBand="0" w:evenHBand="0" w:firstRowFirstColumn="0" w:firstRowLastColumn="0" w:lastRowFirstColumn="0" w:lastRowLastColumn="0"/>
             </w:pPr>
             <w:r>
+              <w:rPr>
+                <w:noProof/>
+              </w:rPr>
               <w:drawing>
                 <wp:anchor distT="0" distB="0" distL="114300" distR="114300" simplePos="0" relativeHeight="251669504" behindDoc="0" locked="0" layoutInCell="1" allowOverlap="1" wp14:anchorId="1FF0604B" wp14:editId="06FD166A">
                   <wp:simplePos x="0" y="0"/>
@@ -2177,6 +2198,9 @@
               <w:cnfStyle w:val="000000000000" w:firstRow="0" w:lastRow="0" w:firstColumn="0" w:lastColumn="0" w:oddVBand="0" w:evenVBand="0" w:oddHBand="0" w:evenHBand="0" w:firstRowFirstColumn="0" w:firstRowLastColumn="0" w:lastRowFirstColumn="0" w:lastRowLastColumn="0"/>
             </w:pPr>
             <w:r>
+              <w:rPr>
+                <w:noProof/>
+              </w:rPr>
               <w:lastRenderedPageBreak/>
               <w:drawing>
                 <wp:anchor distT="0" distB="0" distL="114300" distR="114300" simplePos="0" relativeHeight="251672576" behindDoc="0" locked="0" layoutInCell="1" allowOverlap="1" wp14:anchorId="6B4425D8" wp14:editId="1A706A9A">
@@ -2313,6 +2337,9 @@
               <w:cnfStyle w:val="000000000000" w:firstRow="0" w:lastRow="0" w:firstColumn="0" w:lastColumn="0" w:oddVBand="0" w:evenVBand="0" w:oddHBand="0" w:evenHBand="0" w:firstRowFirstColumn="0" w:firstRowLastColumn="0" w:lastRowFirstColumn="0" w:lastRowLastColumn="0"/>
             </w:pPr>
             <w:r>
+              <w:rPr>
+                <w:noProof/>
+              </w:rPr>
               <w:drawing>
                 <wp:anchor distT="0" distB="0" distL="114300" distR="114300" simplePos="0" relativeHeight="251673600" behindDoc="0" locked="0" layoutInCell="1" allowOverlap="1" wp14:anchorId="5A390F36" wp14:editId="2B560725">
                   <wp:simplePos x="0" y="0"/>
@@ -2458,6 +2485,9 @@
               <w:cnfStyle w:val="000000000000" w:firstRow="0" w:lastRow="0" w:firstColumn="0" w:lastColumn="0" w:oddVBand="0" w:evenVBand="0" w:oddHBand="0" w:evenHBand="0" w:firstRowFirstColumn="0" w:firstRowLastColumn="0" w:lastRowFirstColumn="0" w:lastRowLastColumn="0"/>
             </w:pPr>
             <w:r>
+              <w:rPr>
+                <w:noProof/>
+              </w:rPr>
               <w:lastRenderedPageBreak/>
               <w:drawing>
                 <wp:anchor distT="0" distB="0" distL="114300" distR="114300" simplePos="0" relativeHeight="251674624" behindDoc="0" locked="0" layoutInCell="1" allowOverlap="1" wp14:anchorId="54308783" wp14:editId="4BD24981">
@@ -2571,6 +2601,9 @@
               <w:cnfStyle w:val="000000000000" w:firstRow="0" w:lastRow="0" w:firstColumn="0" w:lastColumn="0" w:oddVBand="0" w:evenVBand="0" w:oddHBand="0" w:evenHBand="0" w:firstRowFirstColumn="0" w:firstRowLastColumn="0" w:lastRowFirstColumn="0" w:lastRowLastColumn="0"/>
             </w:pPr>
             <w:r>
+              <w:rPr>
+                <w:noProof/>
+              </w:rPr>
               <w:drawing>
                 <wp:anchor distT="0" distB="0" distL="114300" distR="114300" simplePos="0" relativeHeight="251676672" behindDoc="0" locked="0" layoutInCell="1" allowOverlap="1" wp14:anchorId="7FFB8883" wp14:editId="163A1244">
                   <wp:simplePos x="0" y="0"/>
@@ -2628,6 +2661,9 @@
               </w:drawing>
             </w:r>
             <w:r>
+              <w:rPr>
+                <w:noProof/>
+              </w:rPr>
               <w:drawing>
                 <wp:anchor distT="0" distB="0" distL="114300" distR="114300" simplePos="0" relativeHeight="251675648" behindDoc="0" locked="0" layoutInCell="1" allowOverlap="1" wp14:anchorId="38CE3285" wp14:editId="781708AC">
                   <wp:simplePos x="0" y="0"/>
@@ -2715,6 +2751,9 @@
               <w:cnfStyle w:val="000000000000" w:firstRow="0" w:lastRow="0" w:firstColumn="0" w:lastColumn="0" w:oddVBand="0" w:evenVBand="0" w:oddHBand="0" w:evenHBand="0" w:firstRowFirstColumn="0" w:firstRowLastColumn="0" w:lastRowFirstColumn="0" w:lastRowLastColumn="0"/>
             </w:pPr>
             <w:r>
+              <w:rPr>
+                <w:noProof/>
+              </w:rPr>
               <w:drawing>
                 <wp:anchor distT="0" distB="0" distL="114300" distR="114300" simplePos="0" relativeHeight="251677696" behindDoc="0" locked="0" layoutInCell="1" allowOverlap="1" wp14:anchorId="50C5A067" wp14:editId="077E29BC">
                   <wp:simplePos x="0" y="0"/>
@@ -2785,6 +2824,9 @@
               <w:cnfStyle w:val="000000000000" w:firstRow="0" w:lastRow="0" w:firstColumn="0" w:lastColumn="0" w:oddVBand="0" w:evenVBand="0" w:oddHBand="0" w:evenHBand="0" w:firstRowFirstColumn="0" w:firstRowLastColumn="0" w:lastRowFirstColumn="0" w:lastRowLastColumn="0"/>
             </w:pPr>
             <w:r>
+              <w:rPr>
+                <w:noProof/>
+              </w:rPr>
               <w:lastRenderedPageBreak/>
               <w:drawing>
                 <wp:inline distT="0" distB="0" distL="0" distR="0" wp14:anchorId="2045C994" wp14:editId="6026EE4D">
@@ -2833,6 +2875,9 @@
               <w:cnfStyle w:val="000000000000" w:firstRow="0" w:lastRow="0" w:firstColumn="0" w:lastColumn="0" w:oddVBand="0" w:evenVBand="0" w:oddHBand="0" w:evenHBand="0" w:firstRowFirstColumn="0" w:firstRowLastColumn="0" w:lastRowFirstColumn="0" w:lastRowLastColumn="0"/>
             </w:pPr>
             <w:r>
+              <w:rPr>
+                <w:noProof/>
+              </w:rPr>
               <w:drawing>
                 <wp:anchor distT="0" distB="0" distL="114300" distR="114300" simplePos="0" relativeHeight="251667456" behindDoc="0" locked="0" layoutInCell="1" allowOverlap="1" wp14:anchorId="033C6874" wp14:editId="49F5E920">
                   <wp:simplePos x="0" y="0"/>
@@ -2884,6 +2929,9 @@
               </w:drawing>
             </w:r>
             <w:r>
+              <w:rPr>
+                <w:noProof/>
+              </w:rPr>
               <w:drawing>
                 <wp:anchor distT="0" distB="0" distL="114300" distR="114300" simplePos="0" relativeHeight="251659264" behindDoc="0" locked="0" layoutInCell="1" allowOverlap="1" wp14:anchorId="0BC63BA9" wp14:editId="1DC5280C">
                   <wp:simplePos x="0" y="0"/>
@@ -2946,6 +2994,9 @@
               <w:cnfStyle w:val="000000000000" w:firstRow="0" w:lastRow="0" w:firstColumn="0" w:lastColumn="0" w:oddVBand="0" w:evenVBand="0" w:oddHBand="0" w:evenHBand="0" w:firstRowFirstColumn="0" w:firstRowLastColumn="0" w:lastRowFirstColumn="0" w:lastRowLastColumn="0"/>
             </w:pPr>
             <w:r>
+              <w:rPr>
+                <w:noProof/>
+              </w:rPr>
               <w:lastRenderedPageBreak/>
               <w:drawing>
                 <wp:anchor distT="0" distB="0" distL="114300" distR="114300" simplePos="0" relativeHeight="251663360" behindDoc="0" locked="0" layoutInCell="1" allowOverlap="1" wp14:anchorId="392F0CDC" wp14:editId="7A3561D2">
@@ -3004,6 +3055,9 @@
               </w:drawing>
             </w:r>
             <w:r>
+              <w:rPr>
+                <w:noProof/>
+              </w:rPr>
               <w:drawing>
                 <wp:anchor distT="0" distB="0" distL="114300" distR="114300" simplePos="0" relativeHeight="251662336" behindDoc="1" locked="0" layoutInCell="1" allowOverlap="1" wp14:anchorId="7E474786" wp14:editId="3FAA2BF8">
                   <wp:simplePos x="0" y="0"/>
@@ -3375,6 +3429,9 @@
     </w:p>
     <w:p>
       <w:r>
+        <w:rPr>
+          <w:noProof/>
+        </w:rPr>
         <w:drawing>
           <wp:inline distT="0" distB="0" distL="0" distR="0" wp14:anchorId="09C0453A" wp14:editId="71737658">
             <wp:extent cx="3105583" cy="781159"/>
@@ -3416,6 +3473,9 @@
     <w:p/>
     <w:p>
       <w:r>
+        <w:rPr>
+          <w:noProof/>
+        </w:rPr>
         <w:drawing>
           <wp:anchor distT="0" distB="0" distL="114300" distR="114300" simplePos="0" relativeHeight="251680768" behindDoc="0" locked="0" layoutInCell="1" allowOverlap="1" wp14:anchorId="5A4B4410" wp14:editId="1497BFC7">
             <wp:simplePos x="0" y="0"/>
@@ -3478,6 +3538,9 @@
     </w:p>
     <w:p>
       <w:r>
+        <w:rPr>
+          <w:noProof/>
+        </w:rPr>
         <w:drawing>
           <wp:inline distT="0" distB="0" distL="0" distR="0" wp14:anchorId="0F834265" wp14:editId="7EB91109">
             <wp:extent cx="3173043" cy="936172"/>
@@ -3563,6 +3626,9 @@
     </w:p>
     <w:p>
       <w:r>
+        <w:rPr>
+          <w:noProof/>
+        </w:rPr>
         <w:drawing>
           <wp:inline distT="0" distB="0" distL="0" distR="0" wp14:anchorId="2EDAA21D" wp14:editId="32B2767B">
             <wp:extent cx="5083810" cy="1668865"/>
@@ -3612,6 +3678,9 @@
     </w:p>
     <w:p>
       <w:r>
+        <w:rPr>
+          <w:noProof/>
+        </w:rPr>
         <w:drawing>
           <wp:inline distT="0" distB="0" distL="0" distR="0" wp14:anchorId="72D7B834" wp14:editId="72272004">
             <wp:extent cx="4923790" cy="1727807"/>
@@ -3690,6 +3759,9 @@
     </w:p>
     <w:p>
       <w:r>
+        <w:rPr>
+          <w:noProof/>
+        </w:rPr>
         <w:drawing>
           <wp:anchor distT="0" distB="0" distL="114300" distR="114300" simplePos="0" relativeHeight="251682816" behindDoc="0" locked="0" layoutInCell="1" allowOverlap="1" wp14:anchorId="5D1B1AEA" wp14:editId="6846D037">
             <wp:simplePos x="0" y="0"/>
@@ -3748,11 +3820,12 @@
       </w:r>
       <w:r>
         <w:rPr>
+          <w:noProof/>
           <w:sz w:val="44"/>
           <w:szCs w:val="44"/>
         </w:rPr>
         <w:drawing>
-          <wp:anchor distT="0" distB="0" distL="114300" distR="114300" simplePos="0" relativeHeight="251681792" behindDoc="0" locked="0" layoutInCell="1" allowOverlap="1" wp14:anchorId="23749E4E" wp14:editId="58807272">
+          <wp:anchor distT="0" distB="0" distL="114300" distR="114300" simplePos="0" relativeHeight="251681792" behindDoc="0" locked="0" layoutInCell="1" allowOverlap="1" wp14:anchorId="23749E4E" wp14:editId="013FFDE5">
             <wp:simplePos x="0" y="0"/>
             <wp:positionH relativeFrom="column">
               <wp:posOffset>5593080</wp:posOffset>
@@ -3818,6 +3891,9 @@
     </w:p>
     <w:p>
       <w:r>
+        <w:rPr>
+          <w:noProof/>
+        </w:rPr>
         <w:drawing>
           <wp:inline distT="0" distB="0" distL="0" distR="0" wp14:anchorId="0865E35C" wp14:editId="2DA8FDCE">
             <wp:extent cx="3729992" cy="966839"/>
@@ -3859,8 +3935,11 @@
     <w:p/>
     <w:p>
       <w:r>
+        <w:rPr>
+          <w:noProof/>
+        </w:rPr>
         <w:drawing>
-          <wp:anchor distT="0" distB="0" distL="114300" distR="114300" simplePos="0" relativeHeight="251685888" behindDoc="0" locked="0" layoutInCell="1" allowOverlap="1" wp14:anchorId="4E168E56" wp14:editId="334F632E">
+          <wp:anchor distT="0" distB="0" distL="114300" distR="114300" simplePos="0" relativeHeight="251685888" behindDoc="0" locked="0" layoutInCell="1" allowOverlap="1" wp14:anchorId="4E168E56" wp14:editId="012EF37F">
             <wp:simplePos x="0" y="0"/>
             <wp:positionH relativeFrom="margin">
               <wp:posOffset>6271261</wp:posOffset>
@@ -3916,6 +3995,9 @@
         </w:drawing>
       </w:r>
       <w:r>
+        <w:rPr>
+          <w:noProof/>
+        </w:rPr>
         <w:drawing>
           <wp:anchor distT="0" distB="0" distL="114300" distR="114300" simplePos="0" relativeHeight="251684864" behindDoc="0" locked="0" layoutInCell="1" allowOverlap="1" wp14:anchorId="76F170EF" wp14:editId="33B3A39C">
             <wp:simplePos x="0" y="0"/>
@@ -3973,6 +4055,9 @@
         </w:drawing>
       </w:r>
       <w:r>
+        <w:rPr>
+          <w:noProof/>
+        </w:rPr>
         <w:drawing>
           <wp:anchor distT="0" distB="0" distL="114300" distR="114300" simplePos="0" relativeHeight="251683840" behindDoc="0" locked="0" layoutInCell="1" allowOverlap="1" wp14:anchorId="0F1C40F7" wp14:editId="05B0B4FF">
             <wp:simplePos x="0" y="0"/>
@@ -4035,6 +4120,9 @@
     </w:p>
     <w:p>
       <w:r>
+        <w:rPr>
+          <w:noProof/>
+        </w:rPr>
         <w:drawing>
           <wp:inline distT="0" distB="0" distL="0" distR="0" wp14:anchorId="343C44C1" wp14:editId="37141392">
             <wp:extent cx="3390900" cy="1531751"/>
@@ -4685,6 +4773,7 @@
   <w:style w:type="character" w:default="1" w:styleId="DefaultParagraphFont">
     <w:name w:val="Default Paragraph Font"/>
     <w:uiPriority w:val="1"/>
+    <w:semiHidden/>
     <w:unhideWhenUsed/>
   </w:style>
   <w:style w:type="table" w:default="1" w:styleId="TableNormal">

</xml_diff>

<commit_message>
Add trials & update tests
</commit_message>
<xml_diff>
--- a/tests/tests.docx
+++ b/tests/tests.docx
@@ -33,6 +33,9 @@
       </w:r>
     </w:p>
     <w:p>
+      <w:r>
+        <w:t xml:space="preserve">Passes. </w:t>
+      </w:r>
       <w:r>
         <w:t xml:space="preserve">See ‘test_bots.py’. To execute from </w:t>
       </w:r>
@@ -299,48 +302,36 @@
                 <w:i w:val="0"/>
                 <w:iCs w:val="0"/>
               </w:rPr>
-              <w:t>Header has 4 links – 3 nav links and the logo which lead to the correct pages.</w:t>
-            </w:r>
-            <w:r>
-              <w:t xml:space="preserve"> </w:t>
-            </w:r>
-          </w:p>
-          <w:p>
-            <w:pPr>
-              <w:jc w:val="left"/>
+              <w:t>Header has 4 links – 3 nav links and the logo which</w:t>
+            </w:r>
+            <w:r>
               <w:rPr>
                 <w:i w:val="0"/>
                 <w:iCs w:val="0"/>
               </w:rPr>
-            </w:pPr>
-          </w:p>
-          <w:p>
-            <w:pPr>
-              <w:jc w:val="left"/>
+              <w:t xml:space="preserve"> should</w:t>
+            </w:r>
+            <w:r>
               <w:rPr>
                 <w:i w:val="0"/>
                 <w:iCs w:val="0"/>
               </w:rPr>
-            </w:pPr>
-            <w:r>
-              <w:t xml:space="preserve"> </w:t>
+              <w:t xml:space="preserve"> lead to the correct </w:t>
             </w:r>
             <w:r>
               <w:rPr>
                 <w:i w:val="0"/>
                 <w:iCs w:val="0"/>
               </w:rPr>
-              <w:t>Header displays correctly on all devices.</w:t>
-            </w:r>
-          </w:p>
-          <w:p>
-            <w:pPr>
-              <w:jc w:val="left"/>
+              <w:t xml:space="preserve">corresponding </w:t>
+            </w:r>
+            <w:r>
               <w:rPr>
                 <w:i w:val="0"/>
                 <w:iCs w:val="0"/>
               </w:rPr>
-            </w:pPr>
+              <w:t>pages.</w:t>
+            </w:r>
             <w:r>
               <w:t xml:space="preserve"> </w:t>
             </w:r>
@@ -362,15 +353,16 @@
                 <w:iCs w:val="0"/>
               </w:rPr>
             </w:pPr>
-          </w:p>
-          <w:p>
-            <w:pPr>
-              <w:jc w:val="left"/>
+            <w:r>
+              <w:t xml:space="preserve"> </w:t>
+            </w:r>
+            <w:r>
               <w:rPr>
                 <w:i w:val="0"/>
                 <w:iCs w:val="0"/>
               </w:rPr>
-            </w:pPr>
+              <w:t>Header displays correctly on all devices.</w:t>
+            </w:r>
           </w:p>
           <w:p>
             <w:pPr>
@@ -380,6 +372,9 @@
                 <w:iCs w:val="0"/>
               </w:rPr>
             </w:pPr>
+            <w:r>
+              <w:t xml:space="preserve"> </w:t>
+            </w:r>
           </w:p>
           <w:p>
             <w:pPr>
@@ -429,29 +424,29 @@
           <w:p>
             <w:pPr>
               <w:jc w:val="left"/>
-            </w:pPr>
-            <w:r>
               <w:rPr>
                 <w:i w:val="0"/>
                 <w:iCs w:val="0"/>
               </w:rPr>
-              <w:lastRenderedPageBreak/>
-              <w:t xml:space="preserve">Footer has </w:t>
-            </w:r>
-            <w:r>
+            </w:pPr>
+          </w:p>
+          <w:p>
+            <w:pPr>
+              <w:jc w:val="left"/>
               <w:rPr>
                 <w:i w:val="0"/>
                 <w:iCs w:val="0"/>
               </w:rPr>
-              <w:t>4 main links – 3 nav and the logo leading to the correct pages.</w:t>
-            </w:r>
-            <w:r>
+            </w:pPr>
+          </w:p>
+          <w:p>
+            <w:pPr>
+              <w:jc w:val="left"/>
               <w:rPr>
                 <w:i w:val="0"/>
                 <w:iCs w:val="0"/>
               </w:rPr>
-              <w:t xml:space="preserve"> Has an additional 9 links under Navigation and Resources which work correctly.</w:t>
-            </w:r>
+            </w:pPr>
           </w:p>
           <w:p>
             <w:pPr>
@@ -465,82 +460,28 @@
           <w:p>
             <w:pPr>
               <w:jc w:val="left"/>
+            </w:pPr>
+            <w:r>
               <w:rPr>
                 <w:i w:val="0"/>
                 <w:iCs w:val="0"/>
               </w:rPr>
-            </w:pPr>
-          </w:p>
-          <w:p>
-            <w:pPr>
-              <w:jc w:val="left"/>
-            </w:pPr>
-          </w:p>
-          <w:p>
-            <w:pPr>
-              <w:jc w:val="left"/>
-            </w:pPr>
+              <w:t xml:space="preserve">Footer has </w:t>
+            </w:r>
             <w:r>
               <w:rPr>
                 <w:i w:val="0"/>
                 <w:iCs w:val="0"/>
               </w:rPr>
-              <w:t>Footer displays correctly on all devices.</w:t>
-            </w:r>
-          </w:p>
-          <w:p>
-            <w:pPr>
-              <w:jc w:val="left"/>
-            </w:pPr>
-          </w:p>
-          <w:p>
-            <w:pPr>
-              <w:jc w:val="left"/>
-            </w:pPr>
-          </w:p>
-          <w:p>
-            <w:pPr>
-              <w:jc w:val="left"/>
-            </w:pPr>
-          </w:p>
-          <w:p>
-            <w:pPr>
-              <w:jc w:val="left"/>
-            </w:pPr>
-          </w:p>
-          <w:p>
-            <w:pPr>
-              <w:jc w:val="left"/>
-            </w:pPr>
-          </w:p>
-          <w:p>
-            <w:pPr>
-              <w:jc w:val="left"/>
-            </w:pPr>
-          </w:p>
-          <w:p>
-            <w:pPr>
-              <w:jc w:val="left"/>
-            </w:pPr>
-          </w:p>
-          <w:p>
-            <w:pPr>
-              <w:jc w:val="left"/>
-            </w:pPr>
-          </w:p>
-          <w:p>
-            <w:pPr>
-              <w:jc w:val="left"/>
-            </w:pPr>
-          </w:p>
-          <w:p>
-            <w:pPr>
-              <w:jc w:val="left"/>
+              <w:t>4 main links – 3 nav and the logo leading to the correct pages.</w:t>
+            </w:r>
+            <w:r>
               <w:rPr>
                 <w:i w:val="0"/>
                 <w:iCs w:val="0"/>
               </w:rPr>
-            </w:pPr>
+              <w:t xml:space="preserve"> Has an additional 9 links under Navigation and Resources which work correctly.</w:t>
+            </w:r>
           </w:p>
           <w:p>
             <w:pPr>
@@ -563,10 +504,63 @@
           <w:p>
             <w:pPr>
               <w:jc w:val="left"/>
+            </w:pPr>
+          </w:p>
+          <w:p>
+            <w:pPr>
+              <w:jc w:val="left"/>
+            </w:pPr>
+            <w:r>
               <w:rPr>
                 <w:i w:val="0"/>
                 <w:iCs w:val="0"/>
               </w:rPr>
+              <w:t>Footer displays correctly on all devices.</w:t>
+            </w:r>
+          </w:p>
+          <w:p>
+            <w:pPr>
+              <w:jc w:val="left"/>
+            </w:pPr>
+          </w:p>
+          <w:p>
+            <w:pPr>
+              <w:jc w:val="left"/>
+            </w:pPr>
+          </w:p>
+          <w:p>
+            <w:pPr>
+              <w:jc w:val="left"/>
+            </w:pPr>
+          </w:p>
+          <w:p>
+            <w:pPr>
+              <w:jc w:val="left"/>
+            </w:pPr>
+          </w:p>
+          <w:p>
+            <w:pPr>
+              <w:jc w:val="left"/>
+            </w:pPr>
+          </w:p>
+          <w:p>
+            <w:pPr>
+              <w:jc w:val="left"/>
+            </w:pPr>
+          </w:p>
+          <w:p>
+            <w:pPr>
+              <w:jc w:val="left"/>
+            </w:pPr>
+          </w:p>
+          <w:p>
+            <w:pPr>
+              <w:jc w:val="left"/>
+            </w:pPr>
+          </w:p>
+          <w:p>
+            <w:pPr>
+              <w:jc w:val="left"/>
             </w:pPr>
           </w:p>
           <w:p>
@@ -581,156 +575,19 @@
           <w:p>
             <w:pPr>
               <w:jc w:val="left"/>
-            </w:pPr>
-          </w:p>
-          <w:p>
-            <w:pPr>
-              <w:jc w:val="left"/>
-            </w:pPr>
-          </w:p>
-          <w:p>
-            <w:pPr>
-              <w:jc w:val="left"/>
-            </w:pPr>
-          </w:p>
-          <w:p>
-            <w:pPr>
-              <w:jc w:val="left"/>
-            </w:pPr>
-          </w:p>
-          <w:p>
-            <w:pPr>
-              <w:jc w:val="left"/>
-            </w:pPr>
-          </w:p>
-          <w:p>
-            <w:pPr>
-              <w:jc w:val="left"/>
-            </w:pPr>
-          </w:p>
-          <w:p>
-            <w:pPr>
-              <w:jc w:val="left"/>
-            </w:pPr>
-            <w:r>
               <w:rPr>
                 <w:i w:val="0"/>
                 <w:iCs w:val="0"/>
               </w:rPr>
-              <w:lastRenderedPageBreak/>
-              <w:t xml:space="preserve">Learn page </w:t>
-            </w:r>
-            <w:r>
+            </w:pPr>
+          </w:p>
+          <w:p>
+            <w:pPr>
+              <w:jc w:val="left"/>
               <w:rPr>
                 <w:i w:val="0"/>
                 <w:iCs w:val="0"/>
               </w:rPr>
-              <w:t>content displays correctly on all devices.</w:t>
-            </w:r>
-          </w:p>
-          <w:p>
-            <w:pPr>
-              <w:jc w:val="left"/>
-            </w:pPr>
-          </w:p>
-          <w:p>
-            <w:pPr>
-              <w:jc w:val="left"/>
-            </w:pPr>
-          </w:p>
-          <w:p>
-            <w:pPr>
-              <w:jc w:val="left"/>
-            </w:pPr>
-          </w:p>
-          <w:p>
-            <w:pPr>
-              <w:jc w:val="left"/>
-            </w:pPr>
-          </w:p>
-          <w:p>
-            <w:pPr>
-              <w:jc w:val="left"/>
-            </w:pPr>
-          </w:p>
-          <w:p>
-            <w:pPr>
-              <w:jc w:val="left"/>
-            </w:pPr>
-          </w:p>
-          <w:p>
-            <w:pPr>
-              <w:jc w:val="left"/>
-            </w:pPr>
-          </w:p>
-          <w:p>
-            <w:pPr>
-              <w:jc w:val="left"/>
-            </w:pPr>
-          </w:p>
-          <w:p>
-            <w:pPr>
-              <w:jc w:val="left"/>
-            </w:pPr>
-          </w:p>
-          <w:p>
-            <w:pPr>
-              <w:jc w:val="left"/>
-            </w:pPr>
-          </w:p>
-          <w:p>
-            <w:pPr>
-              <w:jc w:val="left"/>
-            </w:pPr>
-          </w:p>
-          <w:p>
-            <w:pPr>
-              <w:jc w:val="left"/>
-            </w:pPr>
-          </w:p>
-          <w:p>
-            <w:pPr>
-              <w:jc w:val="left"/>
-            </w:pPr>
-          </w:p>
-          <w:p>
-            <w:pPr>
-              <w:jc w:val="left"/>
-            </w:pPr>
-          </w:p>
-          <w:p>
-            <w:pPr>
-              <w:jc w:val="left"/>
-            </w:pPr>
-          </w:p>
-          <w:p>
-            <w:pPr>
-              <w:jc w:val="left"/>
-            </w:pPr>
-          </w:p>
-          <w:p>
-            <w:pPr>
-              <w:jc w:val="left"/>
-            </w:pPr>
-          </w:p>
-          <w:p>
-            <w:pPr>
-              <w:jc w:val="left"/>
-            </w:pPr>
-          </w:p>
-          <w:p>
-            <w:pPr>
-              <w:jc w:val="left"/>
-            </w:pPr>
-          </w:p>
-          <w:p>
-            <w:pPr>
-              <w:jc w:val="left"/>
-            </w:pPr>
-          </w:p>
-          <w:p>
-            <w:pPr>
-              <w:jc w:val="left"/>
             </w:pPr>
           </w:p>
           <w:p>
@@ -775,11 +632,183 @@
             <w:pPr>
               <w:jc w:val="left"/>
             </w:pPr>
+          </w:p>
+          <w:p>
+            <w:pPr>
+              <w:jc w:val="left"/>
+            </w:pPr>
+          </w:p>
+          <w:p>
+            <w:pPr>
+              <w:jc w:val="left"/>
+            </w:pPr>
             <w:r>
               <w:rPr>
                 <w:i w:val="0"/>
                 <w:iCs w:val="0"/>
               </w:rPr>
+              <w:t xml:space="preserve">Learn page </w:t>
+            </w:r>
+            <w:r>
+              <w:rPr>
+                <w:i w:val="0"/>
+                <w:iCs w:val="0"/>
+              </w:rPr>
+              <w:t>content displays correctly on all devices.</w:t>
+            </w:r>
+          </w:p>
+          <w:p>
+            <w:pPr>
+              <w:jc w:val="left"/>
+            </w:pPr>
+          </w:p>
+          <w:p>
+            <w:pPr>
+              <w:jc w:val="left"/>
+            </w:pPr>
+          </w:p>
+          <w:p>
+            <w:pPr>
+              <w:jc w:val="left"/>
+            </w:pPr>
+          </w:p>
+          <w:p>
+            <w:pPr>
+              <w:jc w:val="left"/>
+            </w:pPr>
+          </w:p>
+          <w:p>
+            <w:pPr>
+              <w:jc w:val="left"/>
+            </w:pPr>
+          </w:p>
+          <w:p>
+            <w:pPr>
+              <w:jc w:val="left"/>
+            </w:pPr>
+          </w:p>
+          <w:p>
+            <w:pPr>
+              <w:jc w:val="left"/>
+            </w:pPr>
+          </w:p>
+          <w:p>
+            <w:pPr>
+              <w:jc w:val="left"/>
+            </w:pPr>
+          </w:p>
+          <w:p>
+            <w:pPr>
+              <w:jc w:val="left"/>
+            </w:pPr>
+          </w:p>
+          <w:p>
+            <w:pPr>
+              <w:jc w:val="left"/>
+            </w:pPr>
+          </w:p>
+          <w:p>
+            <w:pPr>
+              <w:jc w:val="left"/>
+            </w:pPr>
+          </w:p>
+          <w:p>
+            <w:pPr>
+              <w:jc w:val="left"/>
+            </w:pPr>
+          </w:p>
+          <w:p>
+            <w:pPr>
+              <w:jc w:val="left"/>
+            </w:pPr>
+          </w:p>
+          <w:p>
+            <w:pPr>
+              <w:jc w:val="left"/>
+            </w:pPr>
+          </w:p>
+          <w:p>
+            <w:pPr>
+              <w:jc w:val="left"/>
+            </w:pPr>
+          </w:p>
+          <w:p>
+            <w:pPr>
+              <w:jc w:val="left"/>
+            </w:pPr>
+          </w:p>
+          <w:p>
+            <w:pPr>
+              <w:jc w:val="left"/>
+            </w:pPr>
+          </w:p>
+          <w:p>
+            <w:pPr>
+              <w:jc w:val="left"/>
+            </w:pPr>
+          </w:p>
+          <w:p>
+            <w:pPr>
+              <w:jc w:val="left"/>
+            </w:pPr>
+          </w:p>
+          <w:p>
+            <w:pPr>
+              <w:jc w:val="left"/>
+            </w:pPr>
+          </w:p>
+          <w:p>
+            <w:pPr>
+              <w:jc w:val="left"/>
+            </w:pPr>
+          </w:p>
+          <w:p>
+            <w:pPr>
+              <w:jc w:val="left"/>
+              <w:rPr>
+                <w:i w:val="0"/>
+                <w:iCs w:val="0"/>
+              </w:rPr>
+            </w:pPr>
+          </w:p>
+          <w:p>
+            <w:pPr>
+              <w:jc w:val="left"/>
+              <w:rPr>
+                <w:i w:val="0"/>
+                <w:iCs w:val="0"/>
+              </w:rPr>
+            </w:pPr>
+          </w:p>
+          <w:p>
+            <w:pPr>
+              <w:jc w:val="left"/>
+            </w:pPr>
+          </w:p>
+          <w:p>
+            <w:pPr>
+              <w:jc w:val="left"/>
+            </w:pPr>
+          </w:p>
+          <w:p>
+            <w:pPr>
+              <w:jc w:val="left"/>
+            </w:pPr>
+          </w:p>
+          <w:p>
+            <w:pPr>
+              <w:jc w:val="left"/>
+            </w:pPr>
+          </w:p>
+          <w:p>
+            <w:pPr>
+              <w:jc w:val="left"/>
+            </w:pPr>
+            <w:r>
+              <w:rPr>
+                <w:i w:val="0"/>
+                <w:iCs w:val="0"/>
+              </w:rPr>
               <w:lastRenderedPageBreak/>
               <w:t>Play content displays correctly on all pages.</w:t>
             </w:r>
@@ -934,66 +963,71 @@
                 <w:iCs w:val="0"/>
               </w:rPr>
               <w:lastRenderedPageBreak/>
-              <w:t>Tables display correct scores.</w:t>
-            </w:r>
-          </w:p>
-          <w:p>
-            <w:pPr>
-              <w:jc w:val="left"/>
-            </w:pPr>
-          </w:p>
-          <w:p>
-            <w:pPr>
-              <w:jc w:val="left"/>
-            </w:pPr>
-          </w:p>
-          <w:p>
-            <w:pPr>
-              <w:jc w:val="left"/>
-            </w:pPr>
-          </w:p>
-          <w:p>
-            <w:pPr>
-              <w:jc w:val="left"/>
-            </w:pPr>
-          </w:p>
-          <w:p>
-            <w:pPr>
-              <w:jc w:val="left"/>
-            </w:pPr>
-          </w:p>
-          <w:p>
-            <w:pPr>
-              <w:jc w:val="left"/>
-            </w:pPr>
-          </w:p>
-          <w:p>
-            <w:pPr>
-              <w:jc w:val="left"/>
-            </w:pPr>
-          </w:p>
-          <w:p>
-            <w:pPr>
-              <w:jc w:val="left"/>
-            </w:pPr>
-          </w:p>
-          <w:p>
-            <w:pPr>
-              <w:jc w:val="left"/>
-            </w:pPr>
-          </w:p>
-          <w:p>
-            <w:pPr>
-              <w:jc w:val="left"/>
-            </w:pPr>
-          </w:p>
-          <w:p>
-            <w:pPr>
-              <w:jc w:val="left"/>
+              <w:t>Tables display correct scores</w:t>
+            </w:r>
+            <w:r>
               <w:rPr>
                 <w:i w:val="0"/>
                 <w:iCs w:val="0"/>
               </w:rPr>
+              <w:t xml:space="preserve"> depending on user’s actions and the bot</w:t>
+            </w:r>
+            <w:r>
+              <w:rPr>
+                <w:i w:val="0"/>
+                <w:iCs w:val="0"/>
+              </w:rPr>
+              <w:t>.</w:t>
+            </w:r>
+          </w:p>
+          <w:p>
+            <w:pPr>
+              <w:jc w:val="left"/>
+            </w:pPr>
+          </w:p>
+          <w:p>
+            <w:pPr>
+              <w:jc w:val="left"/>
+            </w:pPr>
+          </w:p>
+          <w:p>
+            <w:pPr>
+              <w:jc w:val="left"/>
+            </w:pPr>
+          </w:p>
+          <w:p>
+            <w:pPr>
+              <w:jc w:val="left"/>
+            </w:pPr>
+          </w:p>
+          <w:p>
+            <w:pPr>
+              <w:jc w:val="left"/>
+            </w:pPr>
+          </w:p>
+          <w:p>
+            <w:pPr>
+              <w:jc w:val="left"/>
+            </w:pPr>
+          </w:p>
+          <w:p>
+            <w:pPr>
+              <w:jc w:val="left"/>
+            </w:pPr>
+          </w:p>
+          <w:p>
+            <w:pPr>
+              <w:jc w:val="left"/>
+            </w:pPr>
+          </w:p>
+          <w:p>
+            <w:pPr>
+              <w:jc w:val="left"/>
+            </w:pPr>
+          </w:p>
+          <w:p>
+            <w:pPr>
+              <w:jc w:val="left"/>
             </w:pPr>
           </w:p>
           <w:p>
@@ -1920,7 +1954,13 @@
               <w:t xml:space="preserve"> on laptop, fails </w:t>
             </w:r>
             <w:r>
-              <w:t>tablet and phone.</w:t>
+              <w:t>tablet and phone</w:t>
+            </w:r>
+            <w:r>
+              <w:t xml:space="preserve"> because content extends beyond the screen</w:t>
+            </w:r>
+            <w:r>
+              <w:t>.</w:t>
             </w:r>
           </w:p>
           <w:p>
@@ -2201,7 +2241,6 @@
               <w:rPr>
                 <w:noProof/>
               </w:rPr>
-              <w:lastRenderedPageBreak/>
               <w:drawing>
                 <wp:anchor distT="0" distB="0" distL="114300" distR="114300" simplePos="0" relativeHeight="251672576" behindDoc="0" locked="0" layoutInCell="1" allowOverlap="1" wp14:anchorId="6B4425D8" wp14:editId="1A706A9A">
                   <wp:simplePos x="0" y="0"/>
@@ -2488,7 +2527,6 @@
               <w:rPr>
                 <w:noProof/>
               </w:rPr>
-              <w:lastRenderedPageBreak/>
               <w:drawing>
                 <wp:anchor distT="0" distB="0" distL="114300" distR="114300" simplePos="0" relativeHeight="251674624" behindDoc="0" locked="0" layoutInCell="1" allowOverlap="1" wp14:anchorId="54308783" wp14:editId="4BD24981">
                   <wp:simplePos x="0" y="0"/>
@@ -3596,7 +3634,6 @@
           <w:sz w:val="32"/>
           <w:szCs w:val="32"/>
         </w:rPr>
-        <w:lastRenderedPageBreak/>
         <w:t xml:space="preserve">Footer logo link to </w:t>
       </w:r>
       <w:r>
@@ -3730,46 +3767,78 @@
       </w:pPr>
       <w:r>
         <w:rPr>
+          <w:noProof/>
           <w:sz w:val="44"/>
           <w:szCs w:val="44"/>
         </w:rPr>
-        <w:t>Content</w:t>
+        <w:drawing>
+          <wp:anchor distT="0" distB="0" distL="114300" distR="114300" simplePos="0" relativeHeight="251681792" behindDoc="0" locked="0" layoutInCell="1" allowOverlap="1" wp14:anchorId="23749E4E" wp14:editId="1E397557">
+            <wp:simplePos x="0" y="0"/>
+            <wp:positionH relativeFrom="column">
+              <wp:posOffset>5669280</wp:posOffset>
+            </wp:positionH>
+            <wp:positionV relativeFrom="page">
+              <wp:posOffset>1600200</wp:posOffset>
+            </wp:positionV>
+            <wp:extent cx="3674625" cy="2087880"/>
+            <wp:effectExtent l="0" t="0" r="2540" b="7620"/>
+            <wp:wrapNone/>
+            <wp:docPr id="1337366197" name="Picture 1"/>
+            <wp:cNvGraphicFramePr>
+              <a:graphicFrameLocks xmlns:a="http://schemas.openxmlformats.org/drawingml/2006/main" noChangeAspect="1"/>
+            </wp:cNvGraphicFramePr>
+            <a:graphic xmlns:a="http://schemas.openxmlformats.org/drawingml/2006/main">
+              <a:graphicData uri="http://schemas.openxmlformats.org/drawingml/2006/picture">
+                <pic:pic xmlns:pic="http://schemas.openxmlformats.org/drawingml/2006/picture">
+                  <pic:nvPicPr>
+                    <pic:cNvPr id="1337366197" name=""/>
+                    <pic:cNvPicPr/>
+                  </pic:nvPicPr>
+                  <pic:blipFill>
+                    <a:blip r:embed="rId30" cstate="print">
+                      <a:extLst>
+                        <a:ext uri="{28A0092B-C50C-407E-A947-70E740481C1C}">
+                          <a14:useLocalDpi xmlns:a14="http://schemas.microsoft.com/office/drawing/2010/main" val="0"/>
+                        </a:ext>
+                      </a:extLst>
+                    </a:blip>
+                    <a:stretch>
+                      <a:fillRect/>
+                    </a:stretch>
+                  </pic:blipFill>
+                  <pic:spPr>
+                    <a:xfrm>
+                      <a:off x="0" y="0"/>
+                      <a:ext cx="3674625" cy="2087880"/>
+                    </a:xfrm>
+                    <a:prstGeom prst="rect">
+                      <a:avLst/>
+                    </a:prstGeom>
+                  </pic:spPr>
+                </pic:pic>
+              </a:graphicData>
+            </a:graphic>
+            <wp14:sizeRelH relativeFrom="margin">
+              <wp14:pctWidth>0</wp14:pctWidth>
+            </wp14:sizeRelH>
+            <wp14:sizeRelV relativeFrom="margin">
+              <wp14:pctHeight>0</wp14:pctHeight>
+            </wp14:sizeRelV>
+          </wp:anchor>
+        </w:drawing>
       </w:r>
-      <w:r>
-        <w:rPr>
-          <w:sz w:val="44"/>
-          <w:szCs w:val="44"/>
-        </w:rPr>
-        <w:t xml:space="preserve"> extending out of the</w:t>
-      </w:r>
-      <w:r>
-        <w:rPr>
-          <w:sz w:val="44"/>
-          <w:szCs w:val="44"/>
-        </w:rPr>
-        <w:t xml:space="preserve"> play</w:t>
-      </w:r>
-      <w:r>
-        <w:rPr>
-          <w:sz w:val="44"/>
-          <w:szCs w:val="44"/>
-        </w:rPr>
-        <w:t xml:space="preserve"> page on tablet and mobile:</w:t>
-      </w:r>
-    </w:p>
-    <w:p>
       <w:r>
         <w:rPr>
           <w:noProof/>
         </w:rPr>
         <w:drawing>
-          <wp:anchor distT="0" distB="0" distL="114300" distR="114300" simplePos="0" relativeHeight="251682816" behindDoc="0" locked="0" layoutInCell="1" allowOverlap="1" wp14:anchorId="5D1B1AEA" wp14:editId="6846D037">
+          <wp:anchor distT="0" distB="0" distL="114300" distR="114300" simplePos="0" relativeHeight="251682816" behindDoc="0" locked="0" layoutInCell="1" allowOverlap="1" wp14:anchorId="5D1B1AEA" wp14:editId="6F236E04">
             <wp:simplePos x="0" y="0"/>
             <wp:positionH relativeFrom="margin">
-              <wp:posOffset>4015740</wp:posOffset>
+              <wp:posOffset>4168140</wp:posOffset>
             </wp:positionH>
             <wp:positionV relativeFrom="page">
-              <wp:posOffset>1409700</wp:posOffset>
+              <wp:posOffset>1577340</wp:posOffset>
             </wp:positionV>
             <wp:extent cx="1303020" cy="2057569"/>
             <wp:effectExtent l="0" t="0" r="0" b="0"/>
@@ -3786,7 +3855,7 @@
                     <pic:cNvPicPr/>
                   </pic:nvPicPr>
                   <pic:blipFill>
-                    <a:blip r:embed="rId30" cstate="print">
+                    <a:blip r:embed="rId31" cstate="print">
                       <a:extLst>
                         <a:ext uri="{28A0092B-C50C-407E-A947-70E740481C1C}">
                           <a14:useLocalDpi xmlns:a14="http://schemas.microsoft.com/office/drawing/2010/main" val="0"/>
@@ -3820,23 +3889,58 @@
       </w:r>
       <w:r>
         <w:rPr>
-          <w:noProof/>
           <w:sz w:val="44"/>
           <w:szCs w:val="44"/>
         </w:rPr>
+        <w:t>Content</w:t>
+      </w:r>
+      <w:r>
+        <w:rPr>
+          <w:sz w:val="44"/>
+          <w:szCs w:val="44"/>
+        </w:rPr>
+        <w:t xml:space="preserve"> extending out of the</w:t>
+      </w:r>
+      <w:r>
+        <w:rPr>
+          <w:sz w:val="44"/>
+          <w:szCs w:val="44"/>
+        </w:rPr>
+        <w:t xml:space="preserve"> play</w:t>
+      </w:r>
+      <w:r>
+        <w:rPr>
+          <w:sz w:val="44"/>
+          <w:szCs w:val="44"/>
+        </w:rPr>
+        <w:t xml:space="preserve"> page on tablet and mobile:</w:t>
+      </w:r>
+    </w:p>
+    <w:p>
+      <w:r>
+        <w:t>Before:</w:t>
+      </w:r>
+    </w:p>
+    <w:p>
+      <w:r>
+        <w:t>Width: 80ch; extends beyond small screens.</w:t>
+      </w:r>
+    </w:p>
+    <w:p>
+      <w:r>
         <w:drawing>
-          <wp:anchor distT="0" distB="0" distL="114300" distR="114300" simplePos="0" relativeHeight="251681792" behindDoc="0" locked="0" layoutInCell="1" allowOverlap="1" wp14:anchorId="23749E4E" wp14:editId="013FFDE5">
+          <wp:anchor distT="0" distB="0" distL="114300" distR="114300" simplePos="0" relativeHeight="251686912" behindDoc="0" locked="0" layoutInCell="1" allowOverlap="1" wp14:anchorId="5CF2E42C" wp14:editId="4C666C1E">
             <wp:simplePos x="0" y="0"/>
-            <wp:positionH relativeFrom="column">
-              <wp:posOffset>5593080</wp:posOffset>
+            <wp:positionH relativeFrom="margin">
+              <wp:align>left</wp:align>
             </wp:positionH>
             <wp:positionV relativeFrom="page">
-              <wp:posOffset>1394460</wp:posOffset>
+              <wp:posOffset>3352626</wp:posOffset>
             </wp:positionV>
-            <wp:extent cx="3674625" cy="2087880"/>
-            <wp:effectExtent l="0" t="0" r="2540" b="7620"/>
+            <wp:extent cx="2286000" cy="1143000"/>
+            <wp:effectExtent l="0" t="0" r="0" b="0"/>
             <wp:wrapNone/>
-            <wp:docPr id="1337366197" name="Picture 1"/>
+            <wp:docPr id="499196225" name="Picture 1"/>
             <wp:cNvGraphicFramePr>
               <a:graphicFrameLocks xmlns:a="http://schemas.openxmlformats.org/drawingml/2006/main" noChangeAspect="1"/>
             </wp:cNvGraphicFramePr>
@@ -3844,11 +3948,11 @@
               <a:graphicData uri="http://schemas.openxmlformats.org/drawingml/2006/picture">
                 <pic:pic xmlns:pic="http://schemas.openxmlformats.org/drawingml/2006/picture">
                   <pic:nvPicPr>
-                    <pic:cNvPr id="1337366197" name=""/>
+                    <pic:cNvPr id="499196225" name=""/>
                     <pic:cNvPicPr/>
                   </pic:nvPicPr>
                   <pic:blipFill>
-                    <a:blip r:embed="rId31" cstate="print">
+                    <a:blip r:embed="rId32">
                       <a:extLst>
                         <a:ext uri="{28A0092B-C50C-407E-A947-70E740481C1C}">
                           <a14:useLocalDpi xmlns:a14="http://schemas.microsoft.com/office/drawing/2010/main" val="0"/>
@@ -3862,7 +3966,7 @@
                   <pic:spPr>
                     <a:xfrm>
                       <a:off x="0" y="0"/>
-                      <a:ext cx="3674625" cy="2087880"/>
+                      <a:ext cx="2286000" cy="1143000"/>
                     </a:xfrm>
                     <a:prstGeom prst="rect">
                       <a:avLst/>
@@ -3881,21 +3985,11 @@
         </w:drawing>
       </w:r>
       <w:r>
-        <w:t>Before:</w:t>
-      </w:r>
-    </w:p>
-    <w:p>
-      <w:r>
-        <w:t>Width: 80ch; extends beyond small screens.</w:t>
-      </w:r>
-    </w:p>
-    <w:p>
-      <w:r>
         <w:rPr>
           <w:noProof/>
         </w:rPr>
         <w:drawing>
-          <wp:inline distT="0" distB="0" distL="0" distR="0" wp14:anchorId="0865E35C" wp14:editId="2DA8FDCE">
+          <wp:inline distT="0" distB="0" distL="0" distR="0" wp14:anchorId="0865E35C" wp14:editId="038140AB">
             <wp:extent cx="3729992" cy="966839"/>
             <wp:effectExtent l="0" t="0" r="3810" b="5080"/>
             <wp:docPr id="253194875" name="Picture 1"/>
@@ -3910,7 +4004,7 @@
                     <pic:cNvPicPr/>
                   </pic:nvPicPr>
                   <pic:blipFill>
-                    <a:blip r:embed="rId32"/>
+                    <a:blip r:embed="rId33"/>
                     <a:stretch>
                       <a:fillRect/>
                     </a:stretch>
@@ -3933,13 +4027,15 @@
     </w:p>
     <w:p/>
     <w:p/>
+    <w:p/>
+    <w:p/>
     <w:p>
       <w:r>
         <w:rPr>
           <w:noProof/>
         </w:rPr>
         <w:drawing>
-          <wp:anchor distT="0" distB="0" distL="114300" distR="114300" simplePos="0" relativeHeight="251685888" behindDoc="0" locked="0" layoutInCell="1" allowOverlap="1" wp14:anchorId="4E168E56" wp14:editId="012EF37F">
+          <wp:anchor distT="0" distB="0" distL="114300" distR="114300" simplePos="0" relativeHeight="251685888" behindDoc="0" locked="0" layoutInCell="1" allowOverlap="1" wp14:anchorId="4E168E56" wp14:editId="3C1C8148">
             <wp:simplePos x="0" y="0"/>
             <wp:positionH relativeFrom="margin">
               <wp:posOffset>6271261</wp:posOffset>
@@ -3962,7 +4058,7 @@
                     <pic:cNvPicPr/>
                   </pic:nvPicPr>
                   <pic:blipFill>
-                    <a:blip r:embed="rId33" cstate="print">
+                    <a:blip r:embed="rId34" cstate="print">
                       <a:extLst>
                         <a:ext uri="{28A0092B-C50C-407E-A947-70E740481C1C}">
                           <a14:useLocalDpi xmlns:a14="http://schemas.microsoft.com/office/drawing/2010/main" val="0"/>
@@ -4022,7 +4118,7 @@
                     <pic:cNvPicPr/>
                   </pic:nvPicPr>
                   <pic:blipFill>
-                    <a:blip r:embed="rId34" cstate="print">
+                    <a:blip r:embed="rId35" cstate="print">
                       <a:extLst>
                         <a:ext uri="{28A0092B-C50C-407E-A947-70E740481C1C}">
                           <a14:useLocalDpi xmlns:a14="http://schemas.microsoft.com/office/drawing/2010/main" val="0"/>
@@ -4082,7 +4178,7 @@
                     <pic:cNvPicPr/>
                   </pic:nvPicPr>
                   <pic:blipFill>
-                    <a:blip r:embed="rId35" cstate="print">
+                    <a:blip r:embed="rId36" cstate="print">
                       <a:extLst>
                         <a:ext uri="{28A0092B-C50C-407E-A947-70E740481C1C}">
                           <a14:useLocalDpi xmlns:a14="http://schemas.microsoft.com/office/drawing/2010/main" val="0"/>
@@ -4124,9 +4220,17 @@
           <w:noProof/>
         </w:rPr>
         <w:drawing>
-          <wp:inline distT="0" distB="0" distL="0" distR="0" wp14:anchorId="343C44C1" wp14:editId="37141392">
-            <wp:extent cx="3390900" cy="1531751"/>
+          <wp:anchor distT="0" distB="0" distL="114300" distR="114300" simplePos="0" relativeHeight="251687936" behindDoc="0" locked="0" layoutInCell="1" allowOverlap="1" wp14:anchorId="343C44C1" wp14:editId="09171BA9">
+            <wp:simplePos x="0" y="0"/>
+            <wp:positionH relativeFrom="margin">
+              <wp:align>left</wp:align>
+            </wp:positionH>
+            <wp:positionV relativeFrom="page">
+              <wp:posOffset>5234940</wp:posOffset>
+            </wp:positionV>
+            <wp:extent cx="3390900" cy="1531620"/>
             <wp:effectExtent l="0" t="0" r="0" b="0"/>
+            <wp:wrapNone/>
             <wp:docPr id="666687320" name="Picture 1"/>
             <wp:cNvGraphicFramePr>
               <a:graphicFrameLocks xmlns:a="http://schemas.openxmlformats.org/drawingml/2006/main" noChangeAspect="1"/>
@@ -4139,7 +4243,13 @@
                     <pic:cNvPicPr/>
                   </pic:nvPicPr>
                   <pic:blipFill>
-                    <a:blip r:embed="rId36"/>
+                    <a:blip r:embed="rId37">
+                      <a:extLst>
+                        <a:ext uri="{28A0092B-C50C-407E-A947-70E740481C1C}">
+                          <a14:useLocalDpi xmlns:a14="http://schemas.microsoft.com/office/drawing/2010/main" val="0"/>
+                        </a:ext>
+                      </a:extLst>
+                    </a:blip>
                     <a:stretch>
                       <a:fillRect/>
                     </a:stretch>
@@ -4147,7 +4257,7 @@
                   <pic:spPr>
                     <a:xfrm>
                       <a:off x="0" y="0"/>
-                      <a:ext cx="3400362" cy="1536025"/>
+                      <a:ext cx="3390900" cy="1531620"/>
                     </a:xfrm>
                     <a:prstGeom prst="rect">
                       <a:avLst/>
@@ -4156,10 +4266,14 @@
                 </pic:pic>
               </a:graphicData>
             </a:graphic>
-          </wp:inline>
+          </wp:anchor>
         </w:drawing>
       </w:r>
+      <w:r>
+        <w:t>Content stays within the screen.</w:t>
+      </w:r>
     </w:p>
+    <w:p/>
     <w:sectPr>
       <w:pgSz w:w="16838" w:h="11906" w:orient="landscape"/>
       <w:pgMar w:top="851" w:right="1440" w:bottom="1440" w:left="1440" w:header="709" w:footer="709" w:gutter="0"/>

</xml_diff>